<commit_message>
Document complete HiddenBench model roster
</commit_message>
<xml_diff>
--- a/reports/给彭老师的HiddenBench_MAF复现实验最终报告_2026-07-30_修订版.docx
+++ b/reports/给彭老师的HiddenBench_MAF复现实验最终报告_2026-07-30_修订版.docx
@@ -10093,7 +10093,242 @@
     </w:p>
     <w:p>
       <w:r>
-        <w:t>HiddenBench 官方实现不是 Microsoft Agent Framework、AutoGen 或其他现成群聊框架，而是论文作者自己编写的 Python 模拟器。公开仓库的核心讨论编排位于 src/hiddenbench/simulator.py，模型访问通过自定义 ModelClient 抽象完成。论文评测 15 个模型；本报告选取官方公开结果包中的 GPT-4.1，作为四道题的逐题外部参照。</w:t>
+        <w:t>HiddenBench 官方实现不是 Microsoft Agent Framework、AutoGen 或其他现成群聊框架，而是论文作者自己编写的 Python 模拟器。公开仓库的核心讨论编排位于 src/hiddenbench/simulator.py，模型访问通过自定义 ModelClient 抽象完成。论文正文称评测 15 个模型；作者当前公开的 Figure 3 校验表实际列出 17 个模型配置，完整名单如下。</w:t>
+      </w:r>
+    </w:p>
+    <w:tbl>
+      <w:tblPr>
+        <w:tblStyle w:val="TableGrid"/>
+        <w:tblW w:type="dxa" w:w="9071"/>
+        <w:jc w:val="center"/>
+        <w:tblLayout w:type="fixed"/>
+        <w:tblLook w:firstColumn="1" w:firstRow="1" w:lastColumn="0" w:lastRow="0" w:noHBand="0" w:noVBand="1" w:val="04A0"/>
+      </w:tblPr>
+      <w:tblGrid>
+        <w:gridCol w:w="1928"/>
+        <w:gridCol w:w="7143"/>
+      </w:tblGrid>
+      <w:tr>
+        <w:trPr>
+          <w:tblHeader w:val="true"/>
+          <w:cantSplit/>
+        </w:trPr>
+        <w:tc>
+          <w:tcPr>
+            <w:tcW w:type="dxa" w:w="1928"/>
+            <w:vAlign w:val="center"/>
+            <w:shd w:fill="17365D"/>
+          </w:tcPr>
+          <w:p>
+            <w:pPr>
+              <w:spacing w:after="0" w:before="0"/>
+            </w:pPr>
+            <w:r>
+              <w:rPr>
+                <w:rFonts w:ascii="Microsoft YaHei" w:hAnsi="Microsoft YaHei" w:eastAsia="Microsoft YaHei"/>
+                <w:b/>
+                <w:color w:val="FFFFFF"/>
+                <w:sz w:val="17"/>
+              </w:rPr>
+              <w:t>模型家族</w:t>
+            </w:r>
+          </w:p>
+        </w:tc>
+        <w:tc>
+          <w:tcPr>
+            <w:tcW w:type="dxa" w:w="7143"/>
+            <w:vAlign w:val="center"/>
+            <w:shd w:fill="17365D"/>
+          </w:tcPr>
+          <w:p>
+            <w:pPr>
+              <w:spacing w:after="0" w:before="0"/>
+            </w:pPr>
+            <w:r>
+              <w:rPr>
+                <w:rFonts w:ascii="Microsoft YaHei" w:hAnsi="Microsoft YaHei" w:eastAsia="Microsoft YaHei"/>
+                <w:b/>
+                <w:color w:val="FFFFFF"/>
+                <w:sz w:val="17"/>
+              </w:rPr>
+              <w:t>作者公开结果中的模型配置</w:t>
+            </w:r>
+          </w:p>
+        </w:tc>
+      </w:tr>
+      <w:tr>
+        <w:trPr>
+          <w:cantSplit/>
+        </w:trPr>
+        <w:tc>
+          <w:tcPr>
+            <w:tcW w:type="dxa" w:w="1928"/>
+            <w:vAlign w:val="center"/>
+          </w:tcPr>
+          <w:p>
+            <w:pPr>
+              <w:spacing w:after="0" w:before="0"/>
+            </w:pPr>
+            <w:r>
+              <w:rPr>
+                <w:rFonts w:ascii="Microsoft YaHei" w:hAnsi="Microsoft YaHei" w:eastAsia="Microsoft YaHei"/>
+                <w:sz w:val="17"/>
+              </w:rPr>
+              <w:t>OpenAI GPT（8）</w:t>
+            </w:r>
+          </w:p>
+        </w:tc>
+        <w:tc>
+          <w:tcPr>
+            <w:tcW w:type="dxa" w:w="7143"/>
+            <w:vAlign w:val="center"/>
+          </w:tcPr>
+          <w:p>
+            <w:pPr>
+              <w:spacing w:after="0" w:before="0"/>
+            </w:pPr>
+            <w:r>
+              <w:rPr>
+                <w:rFonts w:ascii="Microsoft YaHei" w:hAnsi="Microsoft YaHei" w:eastAsia="Microsoft YaHei"/>
+                <w:sz w:val="17"/>
+              </w:rPr>
+              <w:t>GPT-4o；GPT-4.1-Nano；GPT-4.1-Mini；GPT-4.1；GPT-5-Nano-Minimal；GPT-5-Mini-Minimal；GPT-5-Minimal；GPT-5-Medium</w:t>
+            </w:r>
+          </w:p>
+        </w:tc>
+      </w:tr>
+      <w:tr>
+        <w:trPr>
+          <w:cantSplit/>
+        </w:trPr>
+        <w:tc>
+          <w:tcPr>
+            <w:tcW w:type="dxa" w:w="1928"/>
+            <w:vAlign w:val="center"/>
+            <w:shd w:fill="EDF4FA"/>
+          </w:tcPr>
+          <w:p>
+            <w:pPr>
+              <w:spacing w:after="0" w:before="0"/>
+            </w:pPr>
+            <w:r>
+              <w:rPr>
+                <w:rFonts w:ascii="Microsoft YaHei" w:hAnsi="Microsoft YaHei" w:eastAsia="Microsoft YaHei"/>
+                <w:sz w:val="17"/>
+              </w:rPr>
+              <w:t>Google Gemini（3）</w:t>
+            </w:r>
+          </w:p>
+        </w:tc>
+        <w:tc>
+          <w:tcPr>
+            <w:tcW w:type="dxa" w:w="7143"/>
+            <w:vAlign w:val="center"/>
+            <w:shd w:fill="EDF4FA"/>
+          </w:tcPr>
+          <w:p>
+            <w:pPr>
+              <w:spacing w:after="0" w:before="0"/>
+            </w:pPr>
+            <w:r>
+              <w:rPr>
+                <w:rFonts w:ascii="Microsoft YaHei" w:hAnsi="Microsoft YaHei" w:eastAsia="Microsoft YaHei"/>
+                <w:sz w:val="17"/>
+              </w:rPr>
+              <w:t>Gemini-2.5-Flash-Lite；Gemini-2.5-Flash；Gemini-2.5-Pro</w:t>
+            </w:r>
+          </w:p>
+        </w:tc>
+      </w:tr>
+      <w:tr>
+        <w:trPr>
+          <w:cantSplit/>
+        </w:trPr>
+        <w:tc>
+          <w:tcPr>
+            <w:tcW w:type="dxa" w:w="1928"/>
+            <w:vAlign w:val="center"/>
+          </w:tcPr>
+          <w:p>
+            <w:pPr>
+              <w:spacing w:after="0" w:before="0"/>
+            </w:pPr>
+            <w:r>
+              <w:rPr>
+                <w:rFonts w:ascii="Microsoft YaHei" w:hAnsi="Microsoft YaHei" w:eastAsia="Microsoft YaHei"/>
+                <w:sz w:val="17"/>
+              </w:rPr>
+              <w:t>Alibaba Qwen（4）</w:t>
+            </w:r>
+          </w:p>
+        </w:tc>
+        <w:tc>
+          <w:tcPr>
+            <w:tcW w:type="dxa" w:w="7143"/>
+            <w:vAlign w:val="center"/>
+          </w:tcPr>
+          <w:p>
+            <w:pPr>
+              <w:spacing w:after="0" w:before="0"/>
+            </w:pPr>
+            <w:r>
+              <w:rPr>
+                <w:rFonts w:ascii="Microsoft YaHei" w:hAnsi="Microsoft YaHei" w:eastAsia="Microsoft YaHei"/>
+                <w:sz w:val="17"/>
+              </w:rPr>
+              <w:t>Qwen3-8B；Qwen3-14B；Qwen3-32B；Qwen3-235B-A22B</w:t>
+            </w:r>
+          </w:p>
+        </w:tc>
+      </w:tr>
+      <w:tr>
+        <w:trPr>
+          <w:cantSplit/>
+        </w:trPr>
+        <w:tc>
+          <w:tcPr>
+            <w:tcW w:type="dxa" w:w="1928"/>
+            <w:vAlign w:val="center"/>
+            <w:shd w:fill="EDF4FA"/>
+          </w:tcPr>
+          <w:p>
+            <w:pPr>
+              <w:spacing w:after="0" w:before="0"/>
+            </w:pPr>
+            <w:r>
+              <w:rPr>
+                <w:rFonts w:ascii="Microsoft YaHei" w:hAnsi="Microsoft YaHei" w:eastAsia="Microsoft YaHei"/>
+                <w:sz w:val="17"/>
+              </w:rPr>
+              <w:t>Meta Llama（2）</w:t>
+            </w:r>
+          </w:p>
+        </w:tc>
+        <w:tc>
+          <w:tcPr>
+            <w:tcW w:type="dxa" w:w="7143"/>
+            <w:vAlign w:val="center"/>
+            <w:shd w:fill="EDF4FA"/>
+          </w:tcPr>
+          <w:p>
+            <w:pPr>
+              <w:spacing w:after="0" w:before="0"/>
+            </w:pPr>
+            <w:r>
+              <w:rPr>
+                <w:rFonts w:ascii="Microsoft YaHei" w:hAnsi="Microsoft YaHei" w:eastAsia="Microsoft YaHei"/>
+                <w:sz w:val="17"/>
+              </w:rPr>
+              <w:t>Llama-4-Scout；Llama-4-Maverick（结果文件名 llama-4）</w:t>
+            </w:r>
+          </w:p>
+        </w:tc>
+      </w:tr>
+    </w:tbl>
+    <w:p/>
+    <w:p>
+      <w:r>
+        <w:t>因此，本报告不把“15”误写成一个不完整名单，而是保留论文正文口径，同时披露当前官方结果包的 17 项实际配置。本实验只选取其中 GPT-4.1，作为四道题的逐题外部参照。</w:t>
       </w:r>
     </w:p>
     <w:p>

</xml_diff>